<commit_message>
feat: add 2026 curriculum revision documentation, templates, and automation tools
</commit_message>
<xml_diff>
--- a/KURIKULUM2026_REVISI/Template_KPT_2024.docx
+++ b/KURIKULUM2026_REVISI/Template_KPT_2024.docx
@@ -23985,8 +23985,8 @@
       <w:footerReference w:type="default" r:id="rId9"/>
       <w:headerReference w:type="first" r:id="rId10"/>
       <w:footerReference w:type="first" r:id="rId11"/>
-      <w:pgSz w:w="12240" w:h="15840"/>
-      <w:pgMar w:top="1417" w:right="1417" w:bottom="1304" w:left="1417" w:header="680" w:footer="680" w:gutter="0"/>
+      <w:pgSz w:w="11906" w:h="16838"/>
+      <w:pgMar w:top="1417" w:right="1417" w:bottom="1417" w:left="1417" w:header="680" w:footer="680" w:gutter="0"/>
       <w:cols w:space="720"/>
       <w:titlePg/>
       <w:docGrid w:linePitch="360"/>

</xml_diff>